<commit_message>
fix: preserve textbook math and spatial query limits
Co-authored-by: Copilot App <223556219+Copilot@users.noreply.github.com>
</commit_message>
<xml_diff>
--- a/docs/education/Kvarken_Thesis_Learn.docx
+++ b/docs/education/Kvarken_Thesis_Learn.docx
@@ -2451,7 +2451,7 @@
           <w:color w:val="144453"/>
           <w:sz w:val="22"/>
         </w:rPr>
-        <w:t>xdB = 10log₁₀(xlᵢₙear)</w:t>
+        <w:t>x_(dB) = 10log₁₀(x_(linear))</w:t>
       </w:r>
     </w:p>
     <w:p>
@@ -2487,7 +2487,7 @@
         <w:rPr>
           <w:rFonts w:ascii="Cambria Math" w:hAnsi="Cambria Math"/>
         </w:rPr>
-        <w:t>xlᵢₙear</w:t>
+        <w:t>x_(linear)</w:t>
       </w:r>
       <w:r>
         <w:t xml:space="preserve"> is a positive, dimensionless power ratio or calibrated normalized power; </w:t>
@@ -2496,7 +2496,7 @@
         <w:rPr>
           <w:rFonts w:ascii="Cambria Math" w:hAnsi="Cambria Math"/>
         </w:rPr>
-        <w:t>xdB</w:t>
+        <w:t>x_(dB)</w:t>
       </w:r>
       <w:r>
         <w:t xml:space="preserve"> is in decibels (dB).</w:t>
@@ -2607,7 +2607,7 @@
         <w:rPr>
           <w:rFonts w:ascii="Cambria Math" w:hAnsi="Cambria Math"/>
         </w:rPr>
-        <w:t>⁰</w:t>
+        <w:t>γ⁰</w:t>
       </w:r>
       <w:r>
         <w:t xml:space="preserve"> samples before converting them to dB; non-positive and non-finite values are marked invalid.</w:t>
@@ -3139,7 +3139,7 @@
           <w:color w:val="144453"/>
           <w:sz w:val="22"/>
         </w:rPr>
-        <w:t>Acell = r²</w:t>
+        <w:t>A_(cell) = r²</w:t>
       </w:r>
     </w:p>
     <w:p>
@@ -3175,7 +3175,7 @@
         <w:rPr>
           <w:rFonts w:ascii="Cambria Math" w:hAnsi="Cambria Math"/>
         </w:rPr>
-        <w:t>Acell</w:t>
+        <w:t>A_(cell)</w:t>
       </w:r>
       <w:r>
         <w:t xml:space="preserve"> is cell area in square metres (m²); </w:t>
@@ -4097,7 +4097,7 @@
         <w:rPr>
           <w:rFonts w:ascii="Cambria Math" w:hAnsi="Cambria Math"/>
         </w:rPr>
-        <w:t>x₁,,xₙ</w:t>
+        <w:t>x₁,…,xₙ</w:t>
       </w:r>
       <w:r>
         <w:t>, the sample mean and sample variance are:</w:t>
@@ -4114,7 +4114,7 @@
           <w:color w:val="144453"/>
           <w:sz w:val="22"/>
         </w:rPr>
-        <w:t>x = (1)/(n)Σᵢ = ₁nxᵢ s² = (1)/(n-1)Σᵢ = ₁n(xᵢ-x)²</w:t>
+        <w:t>x̄ = (1)/(n)Σ(i = 1 to n)xᵢ s² = (1)/(n-1)Σ(i = 1 to n)(xᵢ-x̄)²</w:t>
       </w:r>
     </w:p>
     <w:p>
@@ -4177,7 +4177,7 @@
         <w:rPr>
           <w:rFonts w:ascii="Cambria Math" w:hAnsi="Cambria Math"/>
         </w:rPr>
-        <w:t>x</w:t>
+        <w:t>x̄</w:t>
       </w:r>
       <w:r>
         <w:t xml:space="preserve"> has the units of </w:t>
@@ -4252,7 +4252,7 @@
         <w:rPr>
           <w:rFonts w:ascii="Cambria Math" w:hAnsi="Cambria Math"/>
         </w:rPr>
-        <w:t>x = 4</w:t>
+        <w:t>x̄ = 4</w:t>
       </w:r>
       <w:r>
         <w:t xml:space="preserve">; squared deviations are </w:t>
@@ -4355,7 +4355,7 @@
           <w:color w:val="144453"/>
           <w:sz w:val="22"/>
         </w:rPr>
-        <w:t>sₓᵧ = (1)/(n-1)Σᵢ = ₁n(xᵢ-x)(yᵢ-y)</w:t>
+        <w:t>sₓᵧ = (1)/(n-1)Σ(i = 1 to n)(xᵢ-x̄)(yᵢ-ȳ)</w:t>
       </w:r>
     </w:p>
     <w:p>
@@ -4466,7 +4466,7 @@
         <w:rPr>
           <w:rFonts w:ascii="Cambria Math" w:hAnsi="Cambria Math"/>
         </w:rPr>
-        <w:t>x = 2,y = 4</w:t>
+        <w:t>x̄ = 2,ȳ = 4</w:t>
       </w:r>
       <w:r>
         <w:t xml:space="preserve">, products </w:t>
@@ -4578,7 +4578,7 @@
         <w:rPr>
           <w:rFonts w:ascii="Cambria Math" w:hAnsi="Cambria Math"/>
         </w:rPr>
-        <w:t>x = [VV,VH]T</w:t>
+        <w:t>x = [VV,VH]^(T)</w:t>
       </w:r>
       <w:r>
         <w:t xml:space="preserve">. A </w:t>
@@ -4615,7 +4615,7 @@
           <w:color w:val="144453"/>
           <w:sz w:val="22"/>
         </w:rPr>
-        <w:t>s(x) = (μ₁-μ₀)TΣ⁻¹x -(1)/(2)(μ₁+μ₀)TΣ⁻¹ (μ₁-μ₀)</w:t>
+        <w:t>s(x) = (μ₁-μ₀)^(T)Σ⁻¹x -(1)/(2)(μ₁+μ₀)^(T)Σ⁻¹ (μ₁-μ₀)</w:t>
       </w:r>
     </w:p>
     <w:p>
@@ -4726,7 +4726,7 @@
         <w:rPr>
           <w:rFonts w:ascii="Cambria Math" w:hAnsi="Cambria Math"/>
         </w:rPr>
-        <w:t>μ₀ = [-10,-20]T</w:t>
+        <w:t>μ₀ = [-10,-20]^(T)</w:t>
       </w:r>
       <w:r>
         <w:t xml:space="preserve"> dB and </w:t>
@@ -4735,7 +4735,7 @@
         <w:rPr>
           <w:rFonts w:ascii="Cambria Math" w:hAnsi="Cambria Math"/>
         </w:rPr>
-        <w:t>μ₁ = [-6,-14]T</w:t>
+        <w:t>μ₁ = [-6,-14]^(T)</w:t>
       </w:r>
       <w:r>
         <w:t xml:space="preserve"> dB, and the pooled covariance is </w:t>
@@ -4744,9 +4744,7 @@
         <w:rPr>
           <w:rFonts w:ascii="Cambria Math" w:hAnsi="Cambria Math"/>
         </w:rPr>
-        <w:t>Σ = bmatrix40</w:t>
-        <w:br/>
-        <w:t>04bmatrix</w:t>
+        <w:t>Σ = [[4, 0], [0, 4]]</w:t>
       </w:r>
       <w:r>
         <w:t xml:space="preserve"> dB². Then </w:t>
@@ -4755,7 +4753,7 @@
         <w:rPr>
           <w:rFonts w:ascii="Cambria Math" w:hAnsi="Cambria Math"/>
         </w:rPr>
-        <w:t>Σ⁻¹(μ₁-μ₀) = [1,1.5]T</w:t>
+        <w:t>Σ⁻¹(μ₁-μ₀) = [1,1.5]^(T)</w:t>
       </w:r>
       <w:r>
         <w:t xml:space="preserve"> dB</w:t>
@@ -4773,7 +4771,7 @@
         <w:rPr>
           <w:rFonts w:ascii="Cambria Math" w:hAnsi="Cambria Math"/>
         </w:rPr>
-        <w:t>-12([-16,-34]·[1,1.5]) = 33.5</w:t>
+        <w:t>-(1)/(2)([-16,-34]·[1,1.5]) = 33.5</w:t>
       </w:r>
       <w:r>
         <w:t xml:space="preserve">. For pixel </w:t>
@@ -4782,7 +4780,7 @@
         <w:rPr>
           <w:rFonts w:ascii="Cambria Math" w:hAnsi="Cambria Math"/>
         </w:rPr>
-        <w:t>x = [-7,-16]T</w:t>
+        <w:t>x = [-7,-16]^(T)</w:t>
       </w:r>
       <w:r>
         <w:t xml:space="preserve"> dB, the score is </w:t>
@@ -4861,9 +4859,7 @@
           <w:color w:val="144453"/>
           <w:sz w:val="22"/>
         </w:rPr>
-        <w:t>y = 1, s(x) &gt; t</w:t>
-        <w:br/>
-        <w:t xml:space="preserve"> 0, otherwise</w:t>
+        <w:t>ŷ = cases: 1, s(x) &gt; t; 0, otherwise</w:t>
       </w:r>
     </w:p>
     <w:p>
@@ -4899,7 +4895,7 @@
         <w:rPr>
           <w:rFonts w:ascii="Cambria Math" w:hAnsi="Cambria Math"/>
         </w:rPr>
-        <w:t>y</w:t>
+        <w:t>ŷ</w:t>
       </w:r>
       <w:r>
         <w:t xml:space="preserve"> is the predicted class (0 or 1, dimensionless); </w:t>
@@ -5257,15 +5253,15 @@
         </w:rPr>
         <w:t>Accuracy = (TP+TN)/(TP+TN+FP+FN)</w:t>
         <w:br/>
-        <w:t xml:space="preserve"> Precisionᵢce = (TP)/(TP+FP)</w:t>
+        <w:t xml:space="preserve"> Precision_(ice) = (TP)/(TP+FP)</w:t>
         <w:br/>
-        <w:t xml:space="preserve"> Recallᵢce = (TP)/(TP+FN)</w:t>
+        <w:t xml:space="preserve"> Recall_(ice) = (TP)/(TP+FN)</w:t>
         <w:br/>
-        <w:t xml:space="preserve"> Specificitywater = (TN)/(TN+FP)</w:t>
+        <w:t xml:space="preserve"> Specificity_(water) = (TN)/(TN+FP)</w:t>
         <w:br/>
         <w:t xml:space="preserve"> Balanced accuracy = (1)/(2)( (TP)/(TP+FN)+(TN)/(TN+FP))</w:t>
         <w:br/>
-        <w:t xml:space="preserve"> F1ᵢce = (2 Precisionᵢce Recallᵢce)/() Precisionᵢce+Recallᵢce</w:t>
+        <w:t xml:space="preserve"> F1_(ice) = (2 Precision_(ice) Recall_(ice))/(Precision_(ice)+Recall_(ice))</w:t>
       </w:r>
     </w:p>
     <w:p>
@@ -6041,7 +6037,7 @@
         <w:t>scenes</w:t>
       </w:r>
       <w:r>
-        <w:t xml:space="preserve"> table. A box overlap is a fast pre-filter; the actual code subsequently checks polygon geometry.</w:t>
+        <w:t xml:space="preserve"> table. A box overlap is a fast pre-filter. The current code calls a geometry helper afterward, but that helper accepts overlapping scene bounding boxes immediately, so it does not remove every polygon false positive.</w:t>
       </w:r>
     </w:p>
     <w:p>
@@ -6305,7 +6301,7 @@
           <w:color w:val="144453"/>
           <w:sz w:val="22"/>
         </w:rPr>
-        <w:t>τₙ = (D, d 2n)</w:t>
+        <w:t>τₙ = min(D, d 2ⁿ)</w:t>
       </w:r>
     </w:p>
     <w:p>
@@ -6434,7 +6430,7 @@
         <w:rPr>
           <w:rFonts w:ascii="Cambria Math" w:hAnsi="Cambria Math"/>
         </w:rPr>
-        <w:t>(5,1×2²) = 4</w:t>
+        <w:t>min(5,1×2²) = 4</w:t>
       </w:r>
       <w:r>
         <w:t xml:space="preserve"> s.</w:t>
@@ -9490,7 +9486,7 @@
               <w:rPr>
                 <w:sz w:val="17"/>
               </w:rPr>
-              <w:t>Test upsert, query, exact geometry, concurrent snapshots, reopen and integrity.</w:t>
+              <w:t>Test upsert, bbox-filtered query behavior, concurrent snapshots, reopen and integrity.</w:t>
             </w:r>
           </w:p>
         </w:tc>
@@ -9509,7 +9505,7 @@
               <w:rPr>
                 <w:sz w:val="17"/>
               </w:rPr>
-              <w:t>One embedded database is not distributed scale.</w:t>
+              <w:t>Overlapping bounding boxes can retain polygon false positives; one embedded database is not distributed scale.</w:t>
             </w:r>
           </w:p>
         </w:tc>
@@ -9898,12 +9894,12 @@
         <w:pStyle w:val="Heading3"/>
       </w:pPr>
       <w:r>
-        <w:t>8.5 Spatial catalog and exact queries</w:t>
-      </w:r>
-    </w:p>
-    <w:p>
-      <w:r>
-        <w:t xml:space="preserve">The catalog stores IDs, platform, time, cloud cover, bounding box, CRS code, geometry, and assets. Indexed filters narrow the candidate set. A bounding-box overlap is a necessary quick check; polygon intersection then removes false positives. A region query in this project uses the configured WGS 84 rectangle </w:t>
+        <w:t>8.5 Spatial catalog and region queries</w:t>
+      </w:r>
+    </w:p>
+    <w:p>
+      <w:r>
+        <w:t xml:space="preserve">The catalog stores IDs, platform, time, cloud cover, bounding box, CRS code, geometry, and assets. Indexed filters narrow the candidate set. In the current implementation, SQL selects scenes whose bounding boxes overlap the requested WGS 84 rectangle </w:t>
       </w:r>
       <w:r>
         <w:rPr>
@@ -9914,7 +9910,7 @@
         <w:t>(20.5, 62.8, 22.5, 63.8)</w:t>
       </w:r>
       <w:r>
-        <w:t>.</w:t>
+        <w:t>. The spatial helper immediately accepts an overlapping scene bounding box; it checks polygon intersection only when the scene bounding box does not overlap or is absent. Consequently, a polygon that lies outside the rectangle but has an overlapping bounding box can remain in the results. The query is a useful regional pre-filter, not a guarantee of exact polygon intersection.</w:t>
       </w:r>
     </w:p>
     <w:p>
@@ -10378,7 +10374,7 @@
           <w:color w:val="144453"/>
           <w:sz w:val="22"/>
         </w:rPr>
-        <w:t>L = teₙd - tstart</w:t>
+        <w:t>L = t_(end) - t_(start)</w:t>
       </w:r>
     </w:p>
     <w:p>
@@ -10423,7 +10419,7 @@
         <w:rPr>
           <w:rFonts w:ascii="Cambria Math" w:hAnsi="Cambria Math"/>
         </w:rPr>
-        <w:t>teₙd</w:t>
+        <w:t>t_(end)</w:t>
       </w:r>
       <w:r>
         <w:t xml:space="preserve"> and </w:t>
@@ -10432,7 +10428,7 @@
         <w:rPr>
           <w:rFonts w:ascii="Cambria Math" w:hAnsi="Cambria Math"/>
         </w:rPr>
-        <w:t>tstart</w:t>
+        <w:t>t_(start)</w:t>
       </w:r>
       <w:r>
         <w:t xml:space="preserve"> are timestamps in the same time unit.</w:t>
@@ -10510,7 +10506,7 @@
         <w:t>Thesis connection:</w:t>
       </w:r>
       <w:r>
-        <w:t xml:space="preserve"> The catalog uses bbox pre-filtering and exact geometry checks; 9.117 ms is a local regression point, not a service-level objective.</w:t>
+        <w:t xml:space="preserve"> The catalog uses bbox pre-filtering and a geometry helper, but overlapping scene bounding boxes are accepted without exact polygon rejection; 9.117 ms is a local regression point, not a service-level objective.</w:t>
       </w:r>
     </w:p>
     <w:p>
@@ -11019,7 +11015,7 @@
         <w:rPr>
           <w:rFonts w:ascii="Cambria Math" w:hAnsi="Cambria Math"/>
         </w:rPr>
-        <w:t>⁰</w:t>
+        <w:t>γ⁰</w:t>
       </w:r>
       <w:r>
         <w:t xml:space="preserve"> values are averaged before conversion to dB. This matters because averaging a logarithm is not the same as taking the logarithm of an average.</w:t>
@@ -12888,7 +12884,16 @@
         <w:spacing w:after="40"/>
       </w:pPr>
       <w:r>
-        <w:t>Write a test case that checks both a scene within the ROI and a polygon outside it whose bounding box overlaps.</w:t>
+        <w:t>Write a test showing that the current catalog may return an outside polygon whose bounding box overlaps the ROI.</w:t>
+      </w:r>
+    </w:p>
+    <w:p>
+      <w:pPr>
+        <w:pStyle w:val="ListNumber"/>
+        <w:spacing w:after="40"/>
+      </w:pPr>
+      <w:r>
+        <w:t>As an additional implementation step, add exact polygon intersection filtering after the bbox pre-filter, then test that the false positive is removed.</w:t>
       </w:r>
     </w:p>
     <w:p>
@@ -12899,7 +12904,7 @@
         <w:t>Expected result:</w:t>
       </w:r>
       <w:r>
-        <w:t xml:space="preserve"> The SQL returns candidate records; an exact geometry step removes a false positive.</w:t>
+        <w:t xml:space="preserve"> The existing query returns bbox candidates and may retain a polygon false positive. The proposed additional geometry filter removes it.</w:t>
       </w:r>
     </w:p>
     <w:p>
@@ -12910,7 +12915,7 @@
         <w:t>Troubleshooting:</w:t>
       </w:r>
       <w:r>
-        <w:t xml:space="preserve"> If the query returns a candidate outside the polygon, do not call the SQL wrong: the bounding-box stage is intentionally a pre-filter.</w:t>
+        <w:t xml:space="preserve"> If the existing query returns a polygon outside the ROI, that is a known limitation of the bbox shortcut, not proof of exact intersection. Confirm the additional polygon filter with a regression test.</w:t>
       </w:r>
     </w:p>
     <w:p>
@@ -12965,7 +12970,7 @@
         <w:t>min_y &lt;= roi_max_y</w:t>
       </w:r>
       <w:r>
-        <w:t>. A polygon can have a bounding box overlapping the region while its actual polygon does not.</w:t>
+        <w:t>. A polygon can have a bounding box overlapping the region while its actual polygon does not. The current helper returns true immediately for that bbox overlap; an exact polygon-versus-rectangle test must be added after candidate selection if false positives must be excluded.</w:t>
       </w:r>
     </w:p>
     <w:p>
@@ -12987,7 +12992,18 @@
         <w:t>SpatialCatalog.query_scenes</w:t>
       </w:r>
       <w:r>
-        <w:t xml:space="preserve"> uses bbox SQL conditions followed by exact ROI checks in Python.</w:t>
+        <w:t xml:space="preserve"> uses bbox SQL conditions followed by </w:t>
+      </w:r>
+      <w:r>
+        <w:rPr>
+          <w:rFonts w:ascii="Consolas" w:hAnsi="Consolas"/>
+          <w:color w:val="23545F"/>
+          <w:sz w:val="18"/>
+        </w:rPr>
+        <w:t>scene_intersects_roi</w:t>
+      </w:r>
+      <w:r>
+        <w:t>; that helper accepts bbox overlap immediately, so the current behavior is pre-filtering rather than exact polygon exclusion.</w:t>
       </w:r>
     </w:p>
     <w:p>

</xml_diff>